<commit_message>
Optimize insert path and update design document
</commit_message>
<xml_diff>
--- a/DesignDoc.docx
+++ b/DesignDoc.docx
@@ -57,25 +57,39 @@
           <w:bCs/>
           <w:color w:val="4472C4" w:themeColor="accent1"/>
         </w:rPr>
-        <w:t>Design Lab (</w:t>
-      </w:r>
-      <w:r>
-        <w:rPr>
-          <w:rFonts w:ascii="Times New Roman" w:hAnsi="Times New Roman" w:cs="Times New Roman"/>
-          <w:b/>
-          <w:bCs/>
-          <w:color w:val="4472C4" w:themeColor="accent1"/>
-        </w:rPr>
-        <w:t>CS 69202</w:t>
-      </w:r>
-      <w:r>
-        <w:rPr>
-          <w:rFonts w:ascii="Times New Roman" w:hAnsi="Times New Roman" w:cs="Times New Roman"/>
-          <w:b/>
-          <w:bCs/>
-          <w:color w:val="4472C4" w:themeColor="accent1"/>
-        </w:rPr>
-        <w:t>)</w:t>
+        <w:t>Design Lab (CS 69202)</w:t>
+      </w:r>
+    </w:p>
+    <w:p>
+      <w:pPr>
+        <w:spacing w:after="0"/>
+        <w:jc w:val="center"/>
+        <w:rPr>
+          <w:rFonts w:ascii="Times New Roman" w:hAnsi="Times New Roman" w:cs="Times New Roman"/>
+          <w:b/>
+          <w:bCs/>
+          <w:color w:val="4472C4" w:themeColor="accent1"/>
+        </w:rPr>
+      </w:pPr>
+      <w:proofErr w:type="spellStart"/>
+      <w:r>
+        <w:rPr>
+          <w:rFonts w:ascii="Times New Roman" w:hAnsi="Times New Roman" w:cs="Times New Roman"/>
+          <w:b/>
+          <w:bCs/>
+          <w:color w:val="4472C4" w:themeColor="accent1"/>
+        </w:rPr>
+        <w:t>Github</w:t>
+      </w:r>
+      <w:proofErr w:type="spellEnd"/>
+      <w:r>
+        <w:rPr>
+          <w:rFonts w:ascii="Times New Roman" w:hAnsi="Times New Roman" w:cs="Times New Roman"/>
+          <w:b/>
+          <w:bCs/>
+          <w:color w:val="4472C4" w:themeColor="accent1"/>
+        </w:rPr>
+        <w:t xml:space="preserve"> Link:</w:t>
       </w:r>
     </w:p>
     <w:p>
@@ -1317,6 +1331,337 @@
           <w:rFonts w:ascii="Times New Roman" w:hAnsi="Times New Roman" w:cs="Times New Roman"/>
         </w:rPr>
       </w:pPr>
+    </w:p>
+    <w:p>
+      <w:pPr>
+        <w:rPr>
+          <w:rFonts w:ascii="Times New Roman" w:hAnsi="Times New Roman" w:cs="Times New Roman"/>
+        </w:rPr>
+      </w:pPr>
+      <w:r>
+        <w:rPr>
+          <w:rFonts w:ascii="Times New Roman" w:hAnsi="Times New Roman" w:cs="Times New Roman"/>
+          <w:b/>
+        </w:rPr>
+        <w:t>13. Performance Evaluation</w:t>
+      </w:r>
+    </w:p>
+    <w:p>
+      <w:pPr>
+        <w:rPr>
+          <w:rFonts w:ascii="Times New Roman" w:hAnsi="Times New Roman" w:cs="Times New Roman"/>
+        </w:rPr>
+      </w:pPr>
+      <w:r>
+        <w:rPr>
+          <w:rFonts w:ascii="Times New Roman" w:hAnsi="Times New Roman" w:cs="Times New Roman"/>
+        </w:rPr>
+        <w:lastRenderedPageBreak/>
+        <w:t>The benchmark was executed using:</w:t>
+      </w:r>
+    </w:p>
+    <w:p>
+      <w:pPr>
+        <w:rPr>
+          <w:rFonts w:ascii="Times New Roman" w:hAnsi="Times New Roman" w:cs="Times New Roman"/>
+        </w:rPr>
+      </w:pPr>
+      <w:r>
+        <w:rPr>
+          <w:rFonts w:ascii="Times New Roman" w:hAnsi="Times New Roman" w:cs="Times New Roman"/>
+          <w:b/>
+        </w:rPr>
+        <w:t>.\benchmark.exe 10000000</w:t>
+      </w:r>
+    </w:p>
+    <w:tbl>
+      <w:tblPr>
+        <w:tblW w:w="0" w:type="auto"/>
+        <w:tblLook w:val="04A0" w:firstRow="1" w:lastRow="0" w:firstColumn="1" w:lastColumn="0" w:noHBand="0" w:noVBand="1"/>
+      </w:tblPr>
+      <w:tblGrid>
+        <w:gridCol w:w="4680"/>
+        <w:gridCol w:w="4680"/>
+      </w:tblGrid>
+      <w:tr>
+        <w:tc>
+          <w:tcPr>
+            <w:tcW w:w="4680" w:type="dxa"/>
+          </w:tcPr>
+          <w:p>
+            <w:pPr>
+              <w:rPr>
+                <w:rFonts w:ascii="Times New Roman" w:hAnsi="Times New Roman" w:cs="Times New Roman"/>
+              </w:rPr>
+            </w:pPr>
+            <w:r>
+              <w:rPr>
+                <w:rFonts w:ascii="Times New Roman" w:hAnsi="Times New Roman" w:cs="Times New Roman"/>
+              </w:rPr>
+              <w:t>Metric</w:t>
+            </w:r>
+          </w:p>
+        </w:tc>
+        <w:tc>
+          <w:tcPr>
+            <w:tcW w:w="4680" w:type="dxa"/>
+          </w:tcPr>
+          <w:p>
+            <w:pPr>
+              <w:rPr>
+                <w:rFonts w:ascii="Times New Roman" w:hAnsi="Times New Roman" w:cs="Times New Roman"/>
+              </w:rPr>
+            </w:pPr>
+            <w:r>
+              <w:rPr>
+                <w:rFonts w:ascii="Times New Roman" w:hAnsi="Times New Roman" w:cs="Times New Roman"/>
+              </w:rPr>
+              <w:t>Result</w:t>
+            </w:r>
+          </w:p>
+        </w:tc>
+      </w:tr>
+      <w:tr>
+        <w:tc>
+          <w:tcPr>
+            <w:tcW w:w="4680" w:type="dxa"/>
+          </w:tcPr>
+          <w:p>
+            <w:pPr>
+              <w:rPr>
+                <w:rFonts w:ascii="Times New Roman" w:hAnsi="Times New Roman" w:cs="Times New Roman"/>
+              </w:rPr>
+            </w:pPr>
+            <w:r>
+              <w:rPr>
+                <w:rFonts w:ascii="Times New Roman" w:hAnsi="Times New Roman" w:cs="Times New Roman"/>
+              </w:rPr>
+              <w:t>Rows inserted</w:t>
+            </w:r>
+          </w:p>
+        </w:tc>
+        <w:tc>
+          <w:tcPr>
+            <w:tcW w:w="4680" w:type="dxa"/>
+          </w:tcPr>
+          <w:p>
+            <w:pPr>
+              <w:rPr>
+                <w:rFonts w:ascii="Times New Roman" w:hAnsi="Times New Roman" w:cs="Times New Roman"/>
+              </w:rPr>
+            </w:pPr>
+            <w:r>
+              <w:rPr>
+                <w:rFonts w:ascii="Times New Roman" w:hAnsi="Times New Roman" w:cs="Times New Roman"/>
+              </w:rPr>
+              <w:t>10,000,000</w:t>
+            </w:r>
+          </w:p>
+        </w:tc>
+      </w:tr>
+      <w:tr>
+        <w:tc>
+          <w:tcPr>
+            <w:tcW w:w="4680" w:type="dxa"/>
+          </w:tcPr>
+          <w:p>
+            <w:pPr>
+              <w:rPr>
+                <w:rFonts w:ascii="Times New Roman" w:hAnsi="Times New Roman" w:cs="Times New Roman"/>
+              </w:rPr>
+            </w:pPr>
+            <w:r>
+              <w:rPr>
+                <w:rFonts w:ascii="Times New Roman" w:hAnsi="Times New Roman" w:cs="Times New Roman"/>
+              </w:rPr>
+              <w:t>Total insertion time</w:t>
+            </w:r>
+          </w:p>
+        </w:tc>
+        <w:tc>
+          <w:tcPr>
+            <w:tcW w:w="4680" w:type="dxa"/>
+          </w:tcPr>
+          <w:p>
+            <w:pPr>
+              <w:rPr>
+                <w:rFonts w:ascii="Times New Roman" w:hAnsi="Times New Roman" w:cs="Times New Roman"/>
+              </w:rPr>
+            </w:pPr>
+            <w:r>
+              <w:rPr>
+                <w:rFonts w:ascii="Times New Roman" w:hAnsi="Times New Roman" w:cs="Times New Roman"/>
+              </w:rPr>
+              <w:t>116,989 ms</w:t>
+            </w:r>
+          </w:p>
+        </w:tc>
+      </w:tr>
+      <w:tr>
+        <w:tc>
+          <w:tcPr>
+            <w:tcW w:w="4680" w:type="dxa"/>
+          </w:tcPr>
+          <w:p>
+            <w:pPr>
+              <w:rPr>
+                <w:rFonts w:ascii="Times New Roman" w:hAnsi="Times New Roman" w:cs="Times New Roman"/>
+              </w:rPr>
+            </w:pPr>
+            <w:r>
+              <w:rPr>
+                <w:rFonts w:ascii="Times New Roman" w:hAnsi="Times New Roman" w:cs="Times New Roman"/>
+              </w:rPr>
+              <w:t>Throughput</w:t>
+            </w:r>
+          </w:p>
+        </w:tc>
+        <w:tc>
+          <w:tcPr>
+            <w:tcW w:w="4680" w:type="dxa"/>
+          </w:tcPr>
+          <w:p>
+            <w:pPr>
+              <w:rPr>
+                <w:rFonts w:ascii="Times New Roman" w:hAnsi="Times New Roman" w:cs="Times New Roman"/>
+              </w:rPr>
+            </w:pPr>
+            <w:r>
+              <w:rPr>
+                <w:rFonts w:ascii="Times New Roman" w:hAnsi="Times New Roman" w:cs="Times New Roman"/>
+              </w:rPr>
+              <w:t>85,478 rows/sec</w:t>
+            </w:r>
+          </w:p>
+        </w:tc>
+      </w:tr>
+      <w:tr>
+        <w:tc>
+          <w:tcPr>
+            <w:tcW w:w="4680" w:type="dxa"/>
+          </w:tcPr>
+          <w:p>
+            <w:pPr>
+              <w:rPr>
+                <w:rFonts w:ascii="Times New Roman" w:hAnsi="Times New Roman" w:cs="Times New Roman"/>
+              </w:rPr>
+            </w:pPr>
+            <w:r>
+              <w:rPr>
+                <w:rFonts w:ascii="Times New Roman" w:hAnsi="Times New Roman" w:cs="Times New Roman"/>
+              </w:rPr>
+              <w:t>BIG_USERS table creation time</w:t>
+            </w:r>
+          </w:p>
+        </w:tc>
+        <w:tc>
+          <w:tcPr>
+            <w:tcW w:w="4680" w:type="dxa"/>
+          </w:tcPr>
+          <w:p>
+            <w:pPr>
+              <w:rPr>
+                <w:rFonts w:ascii="Times New Roman" w:hAnsi="Times New Roman" w:cs="Times New Roman"/>
+              </w:rPr>
+            </w:pPr>
+            <w:r>
+              <w:rPr>
+                <w:rFonts w:ascii="Times New Roman" w:hAnsi="Times New Roman" w:cs="Times New Roman"/>
+              </w:rPr>
+              <w:t>1 ms</w:t>
+            </w:r>
+          </w:p>
+        </w:tc>
+      </w:tr>
+      <w:tr>
+        <w:tc>
+          <w:tcPr>
+            <w:tcW w:w="4680" w:type="dxa"/>
+          </w:tcPr>
+          <w:p>
+            <w:pPr>
+              <w:rPr>
+                <w:rFonts w:ascii="Times New Roman" w:hAnsi="Times New Roman" w:cs="Times New Roman"/>
+              </w:rPr>
+            </w:pPr>
+            <w:r>
+              <w:rPr>
+                <w:rFonts w:ascii="Times New Roman" w:hAnsi="Times New Roman" w:cs="Times New Roman"/>
+              </w:rPr>
+              <w:t>Unit test summary</w:t>
+            </w:r>
+          </w:p>
+        </w:tc>
+        <w:tc>
+          <w:tcPr>
+            <w:tcW w:w="4680" w:type="dxa"/>
+          </w:tcPr>
+          <w:p>
+            <w:pPr>
+              <w:rPr>
+                <w:rFonts w:ascii="Times New Roman" w:hAnsi="Times New Roman" w:cs="Times New Roman"/>
+              </w:rPr>
+            </w:pPr>
+            <w:r>
+              <w:rPr>
+                <w:rFonts w:ascii="Times New Roman" w:hAnsi="Times New Roman" w:cs="Times New Roman"/>
+              </w:rPr>
+              <w:t>21/21 passed</w:t>
+            </w:r>
+          </w:p>
+        </w:tc>
+      </w:tr>
+      <w:tr>
+        <w:tc>
+          <w:tcPr>
+            <w:tcW w:w="4680" w:type="dxa"/>
+          </w:tcPr>
+          <w:p>
+            <w:pPr>
+              <w:rPr>
+                <w:rFonts w:ascii="Times New Roman" w:hAnsi="Times New Roman" w:cs="Times New Roman"/>
+              </w:rPr>
+            </w:pPr>
+            <w:r>
+              <w:rPr>
+                <w:rFonts w:ascii="Times New Roman" w:hAnsi="Times New Roman" w:cs="Times New Roman"/>
+              </w:rPr>
+              <w:t>Post-benchmark correctness</w:t>
+            </w:r>
+          </w:p>
+        </w:tc>
+        <w:tc>
+          <w:tcPr>
+            <w:tcW w:w="4680" w:type="dxa"/>
+          </w:tcPr>
+          <w:p>
+            <w:pPr>
+              <w:rPr>
+                <w:rFonts w:ascii="Times New Roman" w:hAnsi="Times New Roman" w:cs="Times New Roman"/>
+              </w:rPr>
+            </w:pPr>
+            <w:r>
+              <w:rPr>
+                <w:rFonts w:ascii="Times New Roman" w:hAnsi="Times New Roman" w:cs="Times New Roman"/>
+              </w:rPr>
+              <w:t>All SQL subset validation tests passed</w:t>
+            </w:r>
+          </w:p>
+        </w:tc>
+      </w:tr>
+    </w:tbl>
+    <w:p>
+      <w:pPr>
+        <w:rPr>
+          <w:rFonts w:ascii="Times New Roman" w:hAnsi="Times New Roman" w:cs="Times New Roman"/>
+        </w:rPr>
+      </w:pPr>
+      <w:r>
+        <w:rPr>
+          <w:rFonts w:ascii="Times New Roman" w:hAnsi="Times New Roman" w:cs="Times New Roman"/>
+        </w:rPr>
+        <w:t>The system successfully inserted 10 million rows and then executed the SQL subset validation checks. All 21 unit tests passed, showing that correctness was preserved after the performance benchmark.</w:t>
+      </w:r>
     </w:p>
     <w:sectPr>
       <w:pgSz w:w="12240" w:h="15840"/>
@@ -1931,6 +2276,7 @@
   <w:style w:type="character" w:default="1" w:styleId="DefaultParagraphFont">
     <w:name w:val="Default Paragraph Font"/>
     <w:uiPriority w:val="1"/>
+    <w:semiHidden/>
     <w:unhideWhenUsed/>
   </w:style>
   <w:style w:type="table" w:default="1" w:styleId="TableNormal">

</xml_diff>